<commit_message>
Clean evidence and regenerate preannotation review sheets
</commit_message>
<xml_diff>
--- a/outputs/EpiSOA_project_flow_summary.docx
+++ b/outputs/EpiSOA_project_flow_summary.docx
@@ -38,13 +38,7 @@
         <w:jc w:val="center"/>
       </w:pPr>
       <w:r>
-        <w:rPr>
-          <w:rFonts w:ascii="Arial" w:hAnsi="Arial" w:eastAsia="Microsoft YaHei"/>
-          <w:b w:val="0"/>
-          <w:color w:val="5F5F5F"/>
-          <w:sz w:val="17"/>
-        </w:rPr>
-        <w:t>更新日期：2026-05-25    目标文件：outputs/EpiSOA_project_flow_summary.docx</w:t>
+        <w:t>更新日期：2026-05-26  目标文件：outputs/EpiSOA_project_flow_summary.docx</w:t>
       </w:r>
     </w:p>
     <w:tbl>
@@ -2824,12 +2818,7 @@
         <w:spacing w:after="40" w:line="252" w:lineRule="auto"/>
       </w:pPr>
       <w:r>
-        <w:rPr>
-          <w:rFonts w:ascii="Arial" w:hAnsi="Arial" w:eastAsia="Microsoft YaHei"/>
-          <w:color w:val="232323"/>
-          <w:sz w:val="18"/>
-        </w:rPr>
-        <w:t>目标：运行完整 EpiSOA pipeline、SOE v2、chain-aware evidence selection、decomposed verifier 和消融设置。</w:t>
+        <w:t>目标：运行主 EpiSOA 方法（Event-SOA graph + event-chain retrieval + chain-aware evidence selection + schema attribution + decomposed verifier）和消融设置。</w:t>
       </w:r>
     </w:p>
     <w:p>
@@ -2852,12 +2841,7 @@
         <w:spacing w:after="40" w:line="252" w:lineRule="auto"/>
       </w:pPr>
       <w:r>
-        <w:rPr>
-          <w:rFonts w:ascii="Arial" w:hAnsi="Arial" w:eastAsia="Microsoft YaHei"/>
-          <w:color w:val="232323"/>
-          <w:sz w:val="18"/>
-        </w:rPr>
-        <w:t>输出：`outputs/runs/{run_id}/` 下的 metrics、summary、main_results、ablation artifacts。</w:t>
+        <w:t>输出：`outputs/runs/{run_id}/` 下的 candidate/verified SOA tuples、evidence_graph/soe_graph、metrics、summary、main_results 和 ablation artifacts。</w:t>
       </w:r>
     </w:p>
     <w:p>
@@ -4375,17 +4359,811 @@
     <w:p>
       <w:pPr>
         <w:pStyle w:val="Heading1"/>
+      </w:pPr>
+      <w:r>
+        <w:t>4. 主 EpiSOA 方法</w:t>
+      </w:r>
+    </w:p>
+    <w:p>
+      <w:pPr/>
+      <w:r>
+        <w:t>主 EpiSOA 方法不是“直接把网页交给 LLM 抽取”，而是一个 evidence-grounded、event-chain-aware、schema-constrained 的 stakeholder opinion attribution 流程。它先把事件证据组织成图和事件链，再进行 chain-aware evidence selection，最后用结构化 LLM 抽取和 faithfulness verifier 生成可审计的 SOA tuples。</w:t>
+      </w:r>
+    </w:p>
+    <w:p>
+      <w:pPr>
+        <w:pStyle w:val="Heading2"/>
+      </w:pPr>
+      <w:r>
+        <w:t>4.1 方法执行路径</w:t>
+      </w:r>
+    </w:p>
+    <w:p>
+      <w:pPr>
+        <w:pStyle w:val="ListNumber"/>
+      </w:pPr>
+      <w:r>
+        <w:t>输入：formal events、canonical evidence、gold tuple/chain files 和模型/API 配置；运行前先检查 paper_data_ready。</w:t>
+      </w:r>
+    </w:p>
+    <w:p>
+      <w:pPr>
+        <w:pStyle w:val="ListNumber"/>
+      </w:pPr>
+      <w:r>
+        <w:t>Evidence graph：从事件和证据构建 stakeholder-event evidence graph，节点包括 event、evidence、source、domain、stakeholder_candidate、temporal_stage_candidate。</w:t>
+      </w:r>
+    </w:p>
+    <w:p>
+      <w:pPr>
+        <w:pStyle w:val="ListNumber"/>
+      </w:pPr>
+      <w:r>
+        <w:t>Event-chain retrieval：对每个事件按 trigger、diffusion、conflict、response、resolution、follow_up 六阶段检索候选证据链；该步骤是规则排序，不读 gold、不调用 LLM。</w:t>
+      </w:r>
+    </w:p>
+    <w:p>
+      <w:pPr>
+        <w:pStyle w:val="ListNumber"/>
+      </w:pPr>
+      <w:r>
+        <w:t>Chain-aware evidence selection：结合事件相关性、阶段覆盖、source diversity、quality_score、stakeholder coverage 选择进入 prompt 的证据包。</w:t>
+      </w:r>
+    </w:p>
+    <w:p>
+      <w:pPr>
+        <w:pStyle w:val="ListNumber"/>
+      </w:pPr>
+      <w:r>
+        <w:t>Schema attribution：LLM 只在所选证据内输出严格 JSON，包括 stakeholder、opinion、sentiment、rationale、evidence_ids、event_chain_stage、support_status 和 confidence。</w:t>
+      </w:r>
+    </w:p>
+    <w:p>
+      <w:pPr>
+        <w:pStyle w:val="ListNumber"/>
+      </w:pPr>
+      <w:r>
+        <w:t>SOE graph：在 full_soe 设置下，把候选 tuple 物化为 Event-SOA graph，连接 event_stage、stakeholder、opinion、sentiment 和 evidence_span。</w:t>
+      </w:r>
+    </w:p>
+    <w:p>
+      <w:pPr>
+        <w:pStyle w:val="ListNumber"/>
+      </w:pPr>
+      <w:r>
+        <w:t>Faithfulness verification：逐条检查 evidence_id 是否存在，并判断证据文本是否支持 stakeholder + opinion claim；输出 verified tuple、support_score 和 decomposed diagnosis。</w:t>
+      </w:r>
+    </w:p>
+    <w:p>
+      <w:pPr>
+        <w:pStyle w:val="Heading2"/>
+      </w:pPr>
+      <w:r>
+        <w:t>4.2 核心模块与可审计产物</w:t>
+      </w:r>
+    </w:p>
+    <w:tbl>
+      <w:tblPr>
+        <w:tblW w:type="auto" w:w="0"/>
+        <w:jc w:val="center"/>
+        <w:tblLayout w:type="fixed"/>
+        <w:tblLook w:firstColumn="1" w:firstRow="1" w:lastColumn="0" w:lastRow="0" w:noHBand="0" w:noVBand="1" w:val="04A0"/>
+      </w:tblPr>
+      <w:tblGrid>
+        <w:gridCol w:w="2851"/>
+        <w:gridCol w:w="2851"/>
+        <w:gridCol w:w="2851"/>
+        <w:gridCol w:w="2851"/>
+        <w:gridCol w:w="2851"/>
+      </w:tblGrid>
+      <w:tr>
+        <w:tc>
+          <w:tcPr>
+            <w:tcW w:type="dxa" w:w="1440"/>
+            <w:vAlign w:val="center"/>
+            <w:shd w:fill="D9EAF7"/>
+          </w:tcPr>
+          <w:p>
+            <w:pPr>
+              <w:spacing w:after="40" w:line="252" w:lineRule="auto"/>
+            </w:pPr>
+            <w:r>
+              <w:rPr>
+                <w:b/>
+                <w:sz w:val="17"/>
+              </w:rPr>
+              <w:t>模块</w:t>
+            </w:r>
+          </w:p>
+        </w:tc>
+        <w:tc>
+          <w:tcPr>
+            <w:tcW w:type="dxa" w:w="2088"/>
+            <w:vAlign w:val="center"/>
+            <w:shd w:fill="D9EAF7"/>
+          </w:tcPr>
+          <w:p>
+            <w:pPr>
+              <w:spacing w:after="40" w:line="252" w:lineRule="auto"/>
+            </w:pPr>
+            <w:r>
+              <w:rPr>
+                <w:b/>
+                <w:sz w:val="17"/>
+              </w:rPr>
+              <w:t>代码入口</w:t>
+            </w:r>
+          </w:p>
+        </w:tc>
+        <w:tc>
+          <w:tcPr>
+            <w:tcW w:type="dxa" w:w="2664"/>
+            <w:vAlign w:val="center"/>
+            <w:shd w:fill="D9EAF7"/>
+          </w:tcPr>
+          <w:p>
+            <w:pPr>
+              <w:spacing w:after="40" w:line="252" w:lineRule="auto"/>
+            </w:pPr>
+            <w:r>
+              <w:rPr>
+                <w:b/>
+                <w:sz w:val="17"/>
+              </w:rPr>
+              <w:t>主要机制</w:t>
+            </w:r>
+          </w:p>
+        </w:tc>
+        <w:tc>
+          <w:tcPr>
+            <w:tcW w:type="dxa" w:w="2232"/>
+            <w:vAlign w:val="center"/>
+            <w:shd w:fill="D9EAF7"/>
+          </w:tcPr>
+          <w:p>
+            <w:pPr>
+              <w:spacing w:after="40" w:line="252" w:lineRule="auto"/>
+            </w:pPr>
+            <w:r>
+              <w:rPr>
+                <w:b/>
+                <w:sz w:val="17"/>
+              </w:rPr>
+              <w:t>输出/诊断</w:t>
+            </w:r>
+          </w:p>
+        </w:tc>
+        <w:tc>
+          <w:tcPr>
+            <w:tcW w:type="dxa" w:w="2376"/>
+            <w:vAlign w:val="center"/>
+            <w:shd w:fill="D9EAF7"/>
+          </w:tcPr>
+          <w:p>
+            <w:pPr>
+              <w:spacing w:after="40" w:line="252" w:lineRule="auto"/>
+            </w:pPr>
+            <w:r>
+              <w:rPr>
+                <w:b/>
+                <w:sz w:val="17"/>
+              </w:rPr>
+              <w:t>论文中回答的问题</w:t>
+            </w:r>
+          </w:p>
+        </w:tc>
+      </w:tr>
+      <w:tr>
+        <w:tc>
+          <w:tcPr>
+            <w:tcW w:type="dxa" w:w="1440"/>
+            <w:vAlign w:val="center"/>
+          </w:tcPr>
+          <w:p>
+            <w:pPr>
+              <w:spacing w:after="40" w:line="252" w:lineRule="auto"/>
+            </w:pPr>
+            <w:r>
+              <w:rPr>
+                <w:sz w:val="17"/>
+              </w:rPr>
+              <w:t>Evidence graph</w:t>
+            </w:r>
+          </w:p>
+        </w:tc>
+        <w:tc>
+          <w:tcPr>
+            <w:tcW w:type="dxa" w:w="2088"/>
+            <w:vAlign w:val="center"/>
+          </w:tcPr>
+          <w:p>
+            <w:pPr>
+              <w:spacing w:after="40" w:line="252" w:lineRule="auto"/>
+            </w:pPr>
+            <w:r>
+              <w:rPr>
+                <w:sz w:val="17"/>
+              </w:rPr>
+              <w:t>src/episoa/graph/evidence_graph.py</w:t>
+            </w:r>
+          </w:p>
+        </w:tc>
+        <w:tc>
+          <w:tcPr>
+            <w:tcW w:type="dxa" w:w="2664"/>
+            <w:vAlign w:val="center"/>
+          </w:tcPr>
+          <w:p>
+            <w:pPr>
+              <w:spacing w:after="40" w:line="252" w:lineRule="auto"/>
+            </w:pPr>
+            <w:r>
+              <w:rPr>
+                <w:sz w:val="17"/>
+              </w:rPr>
+              <w:t>规则抽取 stakeholder/stage/source/domain 结构，形成 event-evidence graph。</w:t>
+            </w:r>
+          </w:p>
+        </w:tc>
+        <w:tc>
+          <w:tcPr>
+            <w:tcW w:type="dxa" w:w="2232"/>
+            <w:vAlign w:val="center"/>
+          </w:tcPr>
+          <w:p>
+            <w:pPr>
+              <w:spacing w:after="40" w:line="252" w:lineRule="auto"/>
+            </w:pPr>
+            <w:r>
+              <w:rPr>
+                <w:sz w:val="17"/>
+              </w:rPr>
+              <w:t>evidence_graph/nodes.jsonl、edges.jsonl、summary.json</w:t>
+            </w:r>
+          </w:p>
+        </w:tc>
+        <w:tc>
+          <w:tcPr>
+            <w:tcW w:type="dxa" w:w="2376"/>
+            <w:vAlign w:val="center"/>
+          </w:tcPr>
+          <w:p>
+            <w:pPr>
+              <w:spacing w:after="40" w:line="252" w:lineRule="auto"/>
+            </w:pPr>
+            <w:r>
+              <w:rPr>
+                <w:sz w:val="17"/>
+              </w:rPr>
+              <w:t>方法是否只依赖 LLM，还是显式建模证据结构？</w:t>
+            </w:r>
+          </w:p>
+        </w:tc>
+      </w:tr>
+      <w:tr>
+        <w:tc>
+          <w:tcPr>
+            <w:tcW w:type="dxa" w:w="1440"/>
+            <w:vAlign w:val="center"/>
+          </w:tcPr>
+          <w:p>
+            <w:pPr>
+              <w:spacing w:after="40" w:line="252" w:lineRule="auto"/>
+            </w:pPr>
+            <w:r>
+              <w:rPr>
+                <w:sz w:val="17"/>
+              </w:rPr>
+              <w:t>Event-chain retrieval</w:t>
+            </w:r>
+          </w:p>
+        </w:tc>
+        <w:tc>
+          <w:tcPr>
+            <w:tcW w:type="dxa" w:w="2088"/>
+            <w:vAlign w:val="center"/>
+          </w:tcPr>
+          <w:p>
+            <w:pPr>
+              <w:spacing w:after="40" w:line="252" w:lineRule="auto"/>
+            </w:pPr>
+            <w:r>
+              <w:rPr>
+                <w:sz w:val="17"/>
+              </w:rPr>
+              <w:t>src/episoa/retrieval/event_chain_retriever.py</w:t>
+            </w:r>
+          </w:p>
+        </w:tc>
+        <w:tc>
+          <w:tcPr>
+            <w:tcW w:type="dxa" w:w="2664"/>
+            <w:vAlign w:val="center"/>
+          </w:tcPr>
+          <w:p>
+            <w:pPr>
+              <w:spacing w:after="40" w:line="252" w:lineRule="auto"/>
+            </w:pPr>
+            <w:r>
+              <w:rPr>
+                <w:sz w:val="17"/>
+              </w:rPr>
+              <w:t>按六个事件阶段对已采集证据评分、去重和排序。</w:t>
+            </w:r>
+          </w:p>
+        </w:tc>
+        <w:tc>
+          <w:tcPr>
+            <w:tcW w:type="dxa" w:w="2232"/>
+            <w:vAlign w:val="center"/>
+          </w:tcPr>
+          <w:p>
+            <w:pPr>
+              <w:spacing w:after="40" w:line="252" w:lineRule="auto"/>
+            </w:pPr>
+            <w:r>
+              <w:rPr>
+                <w:sz w:val="17"/>
+              </w:rPr>
+              <w:t>candidate chains、missing_stages、stage_best_scores</w:t>
+            </w:r>
+          </w:p>
+        </w:tc>
+        <w:tc>
+          <w:tcPr>
+            <w:tcW w:type="dxa" w:w="2376"/>
+            <w:vAlign w:val="center"/>
+          </w:tcPr>
+          <w:p>
+            <w:pPr>
+              <w:spacing w:after="40" w:line="252" w:lineRule="auto"/>
+            </w:pPr>
+            <w:r>
+              <w:rPr>
+                <w:sz w:val="17"/>
+              </w:rPr>
+              <w:t>事件生命周期信息是否提升 SOA 抽取？</w:t>
+            </w:r>
+          </w:p>
+        </w:tc>
+      </w:tr>
+      <w:tr>
+        <w:tc>
+          <w:tcPr>
+            <w:tcW w:type="dxa" w:w="1440"/>
+            <w:vAlign w:val="center"/>
+          </w:tcPr>
+          <w:p>
+            <w:pPr>
+              <w:spacing w:after="40" w:line="252" w:lineRule="auto"/>
+            </w:pPr>
+            <w:r>
+              <w:rPr>
+                <w:sz w:val="17"/>
+              </w:rPr>
+              <w:t>Evidence selector</w:t>
+            </w:r>
+          </w:p>
+        </w:tc>
+        <w:tc>
+          <w:tcPr>
+            <w:tcW w:type="dxa" w:w="2088"/>
+            <w:vAlign w:val="center"/>
+          </w:tcPr>
+          <w:p>
+            <w:pPr>
+              <w:spacing w:after="40" w:line="252" w:lineRule="auto"/>
+            </w:pPr>
+            <w:r>
+              <w:rPr>
+                <w:sz w:val="17"/>
+              </w:rPr>
+              <w:t>src/episoa/retrieval/evidence_selector.py</w:t>
+            </w:r>
+          </w:p>
+        </w:tc>
+        <w:tc>
+          <w:tcPr>
+            <w:tcW w:type="dxa" w:w="2664"/>
+            <w:vAlign w:val="center"/>
+          </w:tcPr>
+          <w:p>
+            <w:pPr>
+              <w:spacing w:after="40" w:line="252" w:lineRule="auto"/>
+            </w:pPr>
+            <w:r>
+              <w:rPr>
+                <w:sz w:val="17"/>
+              </w:rPr>
+              <w:t>chain_aware 默认；baseline 包括 random、quality_topk、bm25_keyword、oracle。</w:t>
+            </w:r>
+          </w:p>
+        </w:tc>
+        <w:tc>
+          <w:tcPr>
+            <w:tcW w:type="dxa" w:w="2232"/>
+            <w:vAlign w:val="center"/>
+          </w:tcPr>
+          <w:p>
+            <w:pPr>
+              <w:spacing w:after="40" w:line="252" w:lineRule="auto"/>
+            </w:pPr>
+            <w:r>
+              <w:rPr>
+                <w:sz w:val="17"/>
+              </w:rPr>
+              <w:t>selected_evidence_ids、selection_diagnostics</w:t>
+            </w:r>
+          </w:p>
+        </w:tc>
+        <w:tc>
+          <w:tcPr>
+            <w:tcW w:type="dxa" w:w="2376"/>
+            <w:vAlign w:val="center"/>
+          </w:tcPr>
+          <w:p>
+            <w:pPr>
+              <w:spacing w:after="40" w:line="252" w:lineRule="auto"/>
+            </w:pPr>
+            <w:r>
+              <w:rPr>
+                <w:sz w:val="17"/>
+              </w:rPr>
+              <w:t>性能来自证据选择，还是来自模型本身？</w:t>
+            </w:r>
+          </w:p>
+        </w:tc>
+      </w:tr>
+      <w:tr>
+        <w:tc>
+          <w:tcPr>
+            <w:tcW w:type="dxa" w:w="1440"/>
+            <w:vAlign w:val="center"/>
+          </w:tcPr>
+          <w:p>
+            <w:pPr>
+              <w:spacing w:after="40" w:line="252" w:lineRule="auto"/>
+            </w:pPr>
+            <w:r>
+              <w:rPr>
+                <w:sz w:val="17"/>
+              </w:rPr>
+              <w:t>Schema attribution</w:t>
+            </w:r>
+          </w:p>
+        </w:tc>
+        <w:tc>
+          <w:tcPr>
+            <w:tcW w:type="dxa" w:w="2088"/>
+            <w:vAlign w:val="center"/>
+          </w:tcPr>
+          <w:p>
+            <w:pPr>
+              <w:spacing w:after="40" w:line="252" w:lineRule="auto"/>
+            </w:pPr>
+            <w:r>
+              <w:rPr>
+                <w:sz w:val="17"/>
+              </w:rPr>
+              <w:t>src/episoa/attribution/schema_attributor.py</w:t>
+            </w:r>
+          </w:p>
+        </w:tc>
+        <w:tc>
+          <w:tcPr>
+            <w:tcW w:type="dxa" w:w="2664"/>
+            <w:vAlign w:val="center"/>
+          </w:tcPr>
+          <w:p>
+            <w:pPr>
+              <w:spacing w:after="40" w:line="252" w:lineRule="auto"/>
+            </w:pPr>
+            <w:r>
+              <w:rPr>
+                <w:sz w:val="17"/>
+              </w:rPr>
+              <w:t>LLM 受 JSON schema、evidence_id 和 stakeholder-canonical 规则约束。</w:t>
+            </w:r>
+          </w:p>
+        </w:tc>
+        <w:tc>
+          <w:tcPr>
+            <w:tcW w:type="dxa" w:w="2232"/>
+            <w:vAlign w:val="center"/>
+          </w:tcPr>
+          <w:p>
+            <w:pPr>
+              <w:spacing w:after="40" w:line="252" w:lineRule="auto"/>
+            </w:pPr>
+            <w:r>
+              <w:rPr>
+                <w:sz w:val="17"/>
+              </w:rPr>
+              <w:t>candidate_soa_tuples.jsonl、raw_llm_responses.jsonl、request_summary</w:t>
+            </w:r>
+          </w:p>
+        </w:tc>
+        <w:tc>
+          <w:tcPr>
+            <w:tcW w:type="dxa" w:w="2376"/>
+            <w:vAlign w:val="center"/>
+          </w:tcPr>
+          <w:p>
+            <w:pPr>
+              <w:spacing w:after="40" w:line="252" w:lineRule="auto"/>
+            </w:pPr>
+            <w:r>
+              <w:rPr>
+                <w:sz w:val="17"/>
+              </w:rPr>
+              <w:t>抽取结果是否可复现、可检查、可定位证据？</w:t>
+            </w:r>
+          </w:p>
+        </w:tc>
+      </w:tr>
+      <w:tr>
+        <w:tc>
+          <w:tcPr>
+            <w:tcW w:type="dxa" w:w="1440"/>
+            <w:vAlign w:val="center"/>
+          </w:tcPr>
+          <w:p>
+            <w:pPr>
+              <w:spacing w:after="40" w:line="252" w:lineRule="auto"/>
+            </w:pPr>
+            <w:r>
+              <w:rPr>
+                <w:sz w:val="17"/>
+              </w:rPr>
+              <w:t>SOE graph</w:t>
+            </w:r>
+          </w:p>
+        </w:tc>
+        <w:tc>
+          <w:tcPr>
+            <w:tcW w:type="dxa" w:w="2088"/>
+            <w:vAlign w:val="center"/>
+          </w:tcPr>
+          <w:p>
+            <w:pPr>
+              <w:spacing w:after="40" w:line="252" w:lineRule="auto"/>
+            </w:pPr>
+            <w:r>
+              <w:rPr>
+                <w:sz w:val="17"/>
+              </w:rPr>
+              <w:t>build_event_soa_graph(...)</w:t>
+            </w:r>
+          </w:p>
+        </w:tc>
+        <w:tc>
+          <w:tcPr>
+            <w:tcW w:type="dxa" w:w="2664"/>
+            <w:vAlign w:val="center"/>
+          </w:tcPr>
+          <w:p>
+            <w:pPr>
+              <w:spacing w:after="40" w:line="252" w:lineRule="auto"/>
+            </w:pPr>
+            <w:r>
+              <w:rPr>
+                <w:sz w:val="17"/>
+              </w:rPr>
+              <w:t>将 tuple 连接到 event_stage、stakeholder、opinion、sentiment、evidence_span。</w:t>
+            </w:r>
+          </w:p>
+        </w:tc>
+        <w:tc>
+          <w:tcPr>
+            <w:tcW w:type="dxa" w:w="2232"/>
+            <w:vAlign w:val="center"/>
+          </w:tcPr>
+          <w:p>
+            <w:pPr>
+              <w:spacing w:after="40" w:line="252" w:lineRule="auto"/>
+            </w:pPr>
+            <w:r>
+              <w:rPr>
+                <w:sz w:val="17"/>
+              </w:rPr>
+              <w:t>soe_graph/nodes.jsonl、edges.jsonl、summary.json</w:t>
+            </w:r>
+          </w:p>
+        </w:tc>
+        <w:tc>
+          <w:tcPr>
+            <w:tcW w:type="dxa" w:w="2376"/>
+            <w:vAlign w:val="center"/>
+          </w:tcPr>
+          <w:p>
+            <w:pPr>
+              <w:spacing w:after="40" w:line="252" w:lineRule="auto"/>
+            </w:pPr>
+            <w:r>
+              <w:rPr>
+                <w:sz w:val="17"/>
+              </w:rPr>
+              <w:t>方法贡献是否超过普通 RAG tuple extraction？</w:t>
+            </w:r>
+          </w:p>
+        </w:tc>
+      </w:tr>
+      <w:tr>
+        <w:tc>
+          <w:tcPr>
+            <w:tcW w:type="dxa" w:w="1440"/>
+            <w:vAlign w:val="center"/>
+          </w:tcPr>
+          <w:p>
+            <w:pPr>
+              <w:spacing w:after="40" w:line="252" w:lineRule="auto"/>
+            </w:pPr>
+            <w:r>
+              <w:rPr>
+                <w:sz w:val="17"/>
+              </w:rPr>
+              <w:t>Verifier</w:t>
+            </w:r>
+          </w:p>
+        </w:tc>
+        <w:tc>
+          <w:tcPr>
+            <w:tcW w:type="dxa" w:w="2088"/>
+            <w:vAlign w:val="center"/>
+          </w:tcPr>
+          <w:p>
+            <w:pPr>
+              <w:spacing w:after="40" w:line="252" w:lineRule="auto"/>
+            </w:pPr>
+            <w:r>
+              <w:rPr>
+                <w:sz w:val="17"/>
+              </w:rPr>
+              <w:t>src/episoa/verifier/faithfulness_verifier.py</w:t>
+            </w:r>
+          </w:p>
+        </w:tc>
+        <w:tc>
+          <w:tcPr>
+            <w:tcW w:type="dxa" w:w="2664"/>
+            <w:vAlign w:val="center"/>
+          </w:tcPr>
+          <w:p>
+            <w:pPr>
+              <w:spacing w:after="40" w:line="252" w:lineRule="auto"/>
+            </w:pPr>
+            <w:r>
+              <w:rPr>
+                <w:sz w:val="17"/>
+              </w:rPr>
+              <w:t>id_only 或 decomposed faithfulness check；默认 decomposed。</w:t>
+            </w:r>
+          </w:p>
+        </w:tc>
+        <w:tc>
+          <w:tcPr>
+            <w:tcW w:type="dxa" w:w="2232"/>
+            <w:vAlign w:val="center"/>
+          </w:tcPr>
+          <w:p>
+            <w:pPr>
+              <w:spacing w:after="40" w:line="252" w:lineRule="auto"/>
+            </w:pPr>
+            <w:r>
+              <w:rPr>
+                <w:sz w:val="17"/>
+              </w:rPr>
+              <w:t>verified_soa_tuples.jsonl、predictions.jsonl、verification_diagnosis</w:t>
+            </w:r>
+          </w:p>
+        </w:tc>
+        <w:tc>
+          <w:tcPr>
+            <w:tcW w:type="dxa" w:w="2376"/>
+            <w:vAlign w:val="center"/>
+          </w:tcPr>
+          <w:p>
+            <w:pPr>
+              <w:spacing w:after="40" w:line="252" w:lineRule="auto"/>
+            </w:pPr>
+            <w:r>
+              <w:rPr>
+                <w:sz w:val="17"/>
+              </w:rPr>
+              <w:t>候选 tuple 是否真的被证据支持？</w:t>
+            </w:r>
+          </w:p>
+        </w:tc>
+      </w:tr>
+    </w:tbl>
+    <w:p>
+      <w:pPr>
+        <w:pStyle w:val="Heading2"/>
+      </w:pPr>
+      <w:r>
+        <w:t>4.3 主方法与消融设置的对应关系</w:t>
+      </w:r>
+    </w:p>
+    <w:p>
+      <w:pPr>
+        <w:pStyle w:val="ListBullet"/>
+      </w:pPr>
+      <w:r>
+        <w:t>full_soe 是论文主方法：启用 evidence graph、event chain、chain-aware selector、SOE graph 和 decomposed verifier。</w:t>
+      </w:r>
+    </w:p>
+    <w:p>
+      <w:pPr>
+        <w:pStyle w:val="ListBullet"/>
+      </w:pPr>
+      <w:r>
+        <w:t>direct_llm 是强 baseline：关闭 graph 和 event chain，只给质量排序证据，检验“直接 LLM 抽取”的上限。</w:t>
+      </w:r>
+    </w:p>
+    <w:p>
+      <w:pPr>
+        <w:pStyle w:val="ListBullet"/>
+      </w:pPr>
+      <w:r>
+        <w:t>without_soe_graph、without_chain_aware_selection、without_decomposed_verifier 分别隔离图结构、链感知证据选择和 verifier 诊断的贡献。</w:t>
+      </w:r>
+    </w:p>
+    <w:p>
+      <w:pPr>
+        <w:pStyle w:val="ListBullet"/>
+      </w:pPr>
+      <w:r>
+        <w:t>quality_topk_selector、bm25_selector、random_selector 用来证明 evidence selection 不是任意 top-k 或随机证据选择。</w:t>
+      </w:r>
+    </w:p>
+    <w:p>
+      <w:pPr>
+        <w:pStyle w:val="ListBullet"/>
+      </w:pPr>
+      <w:r>
+        <w:t>oracle_evidence 只作为 upper-bound diagnostic：它使用 gold evidence ids，但不暴露 gold tuple text。</w:t>
+      </w:r>
+    </w:p>
+    <w:p>
+      <w:pPr>
+        <w:pStyle w:val="Heading2"/>
+      </w:pPr>
+      <w:r>
+        <w:t>4.4 方法边界</w:t>
+      </w:r>
+    </w:p>
+    <w:p>
+      <w:pPr>
+        <w:pStyle w:val="ListBullet"/>
+      </w:pPr>
+      <w:r>
+        <w:t>Event-chain retrieval、graph construction 和 evidence selector 是规则/排序模块；它们不读取 gold tuple 文本。</w:t>
+      </w:r>
+    </w:p>
+    <w:p>
+      <w:pPr>
+        <w:pStyle w:val="ListBullet"/>
+      </w:pPr>
+      <w:r>
+        <w:t>LLM 的角色限于 schema attribution 和 verifier 判定；不能使用外部知识，也不能发明 evidence_id。</w:t>
+      </w:r>
+    </w:p>
+    <w:p>
+      <w:pPr>
+        <w:pStyle w:val="ListBullet"/>
+      </w:pPr>
+      <w:r>
+        <w:t>如果 configs/paper.yaml 仍指向 llm_gold_*，评测对象仍是 pseudo-gold；最终论文口径应切换到通过 audit 的 human_gold_v2。</w:t>
+      </w:r>
+    </w:p>
+    <w:p>
+      <w:pPr>
+        <w:pStyle w:val="Heading1"/>
         <w:spacing w:before="160" w:after="80"/>
         <w:keepNext/>
       </w:pPr>
       <w:r>
-        <w:rPr>
-          <w:rFonts w:ascii="Arial" w:hAnsi="Arial" w:eastAsia="Microsoft YaHei"/>
-          <w:b/>
-          <w:color w:val="1F4E79"/>
-          <w:sz w:val="32"/>
-        </w:rPr>
-        <w:t>4. LLM 使用点</w:t>
+        <w:t>5. LLM 使用点</w:t>
       </w:r>
     </w:p>
     <w:tbl>
@@ -5630,13 +6408,7 @@
         <w:keepNext/>
       </w:pPr>
       <w:r>
-        <w:rPr>
-          <w:rFonts w:ascii="Arial" w:hAnsi="Arial" w:eastAsia="Microsoft YaHei"/>
-          <w:b/>
-          <w:color w:val="1F4E79"/>
-          <w:sz w:val="32"/>
-        </w:rPr>
-        <w:t>5. 人工审核点</w:t>
+        <w:t>6. 人工审核点</w:t>
       </w:r>
     </w:p>
     <w:tbl>
@@ -6590,13 +7362,7 @@
         <w:keepNext/>
       </w:pPr>
       <w:r>
-        <w:rPr>
-          <w:rFonts w:ascii="Arial" w:hAnsi="Arial" w:eastAsia="Microsoft YaHei"/>
-          <w:b/>
-          <w:color w:val="1F4E79"/>
-          <w:sz w:val="32"/>
-        </w:rPr>
-        <w:t>6. 下一步执行顺序</w:t>
+        <w:t>7. 下一步执行顺序</w:t>
       </w:r>
     </w:p>
     <w:p>
@@ -7611,13 +8377,7 @@
         <w:keepNext/>
       </w:pPr>
       <w:r>
-        <w:rPr>
-          <w:rFonts w:ascii="Arial" w:hAnsi="Arial" w:eastAsia="Microsoft YaHei"/>
-          <w:b/>
-          <w:color w:val="1F4E79"/>
-          <w:sz w:val="32"/>
-        </w:rPr>
-        <w:t>7. 关键注意事项</w:t>
+        <w:t>8. 关键注意事项</w:t>
       </w:r>
     </w:p>
     <w:p>
@@ -7697,13 +8457,7 @@
         <w:keepNext/>
       </w:pPr>
       <w:r>
-        <w:rPr>
-          <w:rFonts w:ascii="Arial" w:hAnsi="Arial" w:eastAsia="Microsoft YaHei"/>
-          <w:b/>
-          <w:color w:val="1F4E79"/>
-          <w:sz w:val="32"/>
-        </w:rPr>
-        <w:t>8. 依据文件</w:t>
+        <w:t>9. 依据文件</w:t>
       </w:r>
     </w:p>
     <w:p>
@@ -7760,6 +8514,14 @@
           <w:sz w:val="18"/>
         </w:rPr>
         <w:t>`configs/paper.yaml`、`configs/ablation.yaml`：正式实验/消融输入路径、模型和输出目录。</w:t>
+      </w:r>
+    </w:p>
+    <w:p>
+      <w:pPr>
+        <w:pStyle w:val="ListBullet"/>
+      </w:pPr>
+      <w:r>
+        <w:t>`src/episoa/pipeline.py`、`src/episoa/retrieval/evidence_selector.py`、`src/episoa/attribution/schema_attributor.py`、`src/episoa/verifier/faithfulness_verifier.py`：主 EpiSOA 方法实现。</w:t>
       </w:r>
     </w:p>
     <w:sectPr>

</xml_diff>